<commit_message>
docs(features): regenerate HXC-107 ledger exports to rev8 (html, pdf, docx)
§11.4.65 / §11.4.153(6) sync: the rev8 reconciliation (commit 47f61829) updated
Status.md + Status_Summary.md but left the derived siblings stale (dated Jun 16).
Regenerated all 6 via the §11.4.106 docs_chain `features` context (pandoc-html +
weasyprint-pdf; verify reports in-sync) and pandoc for docx. Each export verified
to carry the rev8 content — the literal rev8 revision string, the corrected
internal-pkg count 72, the cli_agents count 50, and the i18n_wiring sole-test-only
note — proving they reflect the new reconciled markdown, not the stale content.
docs_chain sync evidence captured under qa-results/ (gitignored). Independent
review GO.

Co-Authored-By: Claude Opus 4.8 (1M context) <noreply@anthropic.com>
</commit_message>
<xml_diff>
--- a/docs/features/Status_Summary.docx
+++ b/docs/features/Status_Summary.docx
@@ -14,7 +14,8 @@
     <w:tbl>
       <w:tblPr>
         <w:tblStyle w:val="Table"/>
-        <w:tblW w:type="auto" w:w="0"/>
+        <w:tblW w:type="pct" w:w="5000"/>
+        <w:tblLayout w:type="fixed"/>
         <w:tblLook w:firstRow="0" w:lastRow="0" w:firstColumn="0" w:lastColumn="0" w:noHBand="0" w:noVBand="0" w:val="0000"/>
       </w:tblPr>
       <w:tblGrid>
@@ -40,7 +41,7 @@
               <w:pStyle w:val="Compact"/>
             </w:pPr>
             <w:r>
-              <w:t xml:space="preserve">4</w:t>
+              <w:t xml:space="preserve">5</w:t>
             </w:r>
           </w:p>
         </w:tc>
@@ -88,7 +89,7 @@
               <w:pStyle w:val="Compact"/>
             </w:pPr>
             <w:r>
-              <w:t xml:space="preserve">2026-06-16</w:t>
+              <w:t xml:space="preserve">2026-06-22</w:t>
             </w:r>
           </w:p>
         </w:tc>
@@ -112,7 +113,7 @@
               <w:pStyle w:val="Compact"/>
             </w:pPr>
             <w:r>
-              <w:t xml:space="preserve">active (rev7 — 2026-06-16 video-confirmation sweep)</w:t>
+              <w:t xml:space="preserve">active (rev8 — HXC-107 code-reconciliation audit synced from Status.md rev8: internal-pkg 73→72, cli_agents 51→50, submodules 67-on-disk → 65 rowed + 2 documented exclusions)</w:t>
             </w:r>
           </w:p>
         </w:tc>
@@ -1397,13 +1398,13 @@
       </w:r>
     </w:p>
     <w:bookmarkEnd w:id="12"/>
-    <w:bookmarkStart w:id="13" w:name="X002bd645fb74c4ecbfd453149db8254e35c17ad"/>
+    <w:bookmarkStart w:id="13" w:name="X3fa44efe1819d293f588cced5fd47bc63f7f28f"/>
     <w:p>
       <w:pPr>
         <w:pStyle w:val="Heading2"/>
       </w:pPr>
       <w:r>
-        <w:t xml:space="preserve">Coverage completeness (rev6 gap-pass, 2026-06-16)</w:t>
+        <w:t xml:space="preserve">Coverage completeness (rev8 code-reconciliation, verified vs live tree 2026-06-22)</w:t>
       </w:r>
     </w:p>
     <w:p>
@@ -1425,7 +1426,7 @@
         <w:t xml:space="preserve"> </w:t>
       </w:r>
       <w:r>
-        <w:t xml:space="preserve">73/73 have ≥1 feature row (the last gap,</w:t>
+        <w:t xml:space="preserve">72/72 dirs have ≥1 feature row (71 with production code +</w:t>
       </w:r>
       <w:r>
         <w:t xml:space="preserve"> </w:t>
@@ -1437,7 +1438,40 @@
         <w:t xml:space="preserve">internal/i18n_wiring</w:t>
       </w:r>
       <w:r>
-        <w:t xml:space="preserve">, closed this rev). 234 internal-feature rows.</w:t>
+        <w:t xml:space="preserve">, the sole test-only dir). 234 internal-feature rows.</w:t>
+      </w:r>
+      <w:r>
+        <w:t xml:space="preserve"> </w:t>
+      </w:r>
+      <w:r>
+        <w:t xml:space="preserve">(rev8: count corrected 73→72 per</w:t>
+      </w:r>
+      <w:r>
+        <w:t xml:space="preserve"> </w:t>
+      </w:r>
+      <w:r>
+        <w:rPr>
+          <w:rStyle w:val="VerbatimChar"/>
+        </w:rPr>
+        <w:t xml:space="preserve">ls -d helix_code/internal/*/</w:t>
+      </w:r>
+      <w:r>
+        <w:t xml:space="preserve"> </w:t>
+      </w:r>
+      <w:r>
+        <w:t xml:space="preserve">= 72 — the prior</w:t>
+      </w:r>
+      <w:r>
+        <w:t xml:space="preserve"> </w:t>
+      </w:r>
+      <w:r>
+        <w:t xml:space="preserve">“73/73”</w:t>
+      </w:r>
+      <w:r>
+        <w:t xml:space="preserve"> </w:t>
+      </w:r>
+      <w:r>
+        <w:t xml:space="preserve">was an off-by-one.)</w:t>
       </w:r>
     </w:p>
     <w:p>
@@ -1496,13 +1530,86 @@
         <w:t xml:space="preserve"> </w:t>
       </w:r>
       <w:r>
-        <w:t xml:space="preserve">all 6 surfaces (CLI, TUI, Web, Desktop, Android, iOS) +</w:t>
-      </w:r>
-      <w:r>
-        <w:t xml:space="preserve"> </w:t>
-      </w:r>
-      <w:r>
-        <w:t xml:space="preserve">Aurora OS / Harmony OS rowed.</w:t>
+        <w:t xml:space="preserve">all 6</w:t>
+      </w:r>
+      <w:r>
+        <w:t xml:space="preserve"> </w:t>
+      </w:r>
+      <w:r>
+        <w:rPr>
+          <w:rStyle w:val="VerbatimChar"/>
+        </w:rPr>
+        <w:t xml:space="preserve">applications/*</w:t>
+      </w:r>
+      <w:r>
+        <w:t xml:space="preserve"> </w:t>
+      </w:r>
+      <w:r>
+        <w:t xml:space="preserve">dirs (Desktop, Terminal-UI, iOS, Android,</w:t>
+      </w:r>
+      <w:r>
+        <w:t xml:space="preserve"> </w:t>
+      </w:r>
+      <w:r>
+        <w:t xml:space="preserve">Aurora OS, Harmony OS) rowed; 8 client</w:t>
+      </w:r>
+      <w:r>
+        <w:t xml:space="preserve"> </w:t>
+      </w:r>
+      <w:r>
+        <w:rPr>
+          <w:i/>
+          <w:iCs/>
+        </w:rPr>
+        <w:t xml:space="preserve">surfaces</w:t>
+      </w:r>
+      <w:r>
+        <w:t xml:space="preserve"> </w:t>
+      </w:r>
+      <w:r>
+        <w:t xml:space="preserve">total counting CLI (</w:t>
+      </w:r>
+      <w:r>
+        <w:rPr>
+          <w:rStyle w:val="VerbatimChar"/>
+        </w:rPr>
+        <w:t xml:space="preserve">cmd/cli</w:t>
+      </w:r>
+      <w:r>
+        <w:t xml:space="preserve">) +</w:t>
+      </w:r>
+      <w:r>
+        <w:t xml:space="preserve"> </w:t>
+      </w:r>
+      <w:r>
+        <w:t xml:space="preserve">Web (</w:t>
+      </w:r>
+      <w:r>
+        <w:rPr>
+          <w:rStyle w:val="VerbatimChar"/>
+        </w:rPr>
+        <w:t xml:space="preserve">internal/server</w:t>
+      </w:r>
+      <w:r>
+        <w:t xml:space="preserve">). iOS/Android confirmed buildable rev8 (real Gradle/Xcode</w:t>
+      </w:r>
+      <w:r>
+        <w:t xml:space="preserve"> </w:t>
+      </w:r>
+      <w:r>
+        <w:t xml:space="preserve">chains + gomobile-bind artifacts present — prior</w:t>
+      </w:r>
+      <w:r>
+        <w:t xml:space="preserve"> </w:t>
+      </w:r>
+      <w:r>
+        <w:t xml:space="preserve">“not buildable”</w:t>
+      </w:r>
+      <w:r>
+        <w:t xml:space="preserve"> </w:t>
+      </w:r>
+      <w:r>
+        <w:t xml:space="preserve">claim struck).</w:t>
       </w:r>
     </w:p>
     <w:p>
@@ -1546,7 +1653,91 @@
         <w:t xml:space="preserve"> </w:t>
       </w:r>
       <w:r>
-        <w:t xml:space="preserve">50 inventoried (55 capability rows; principal features).</w:t>
+        <w:t xml:space="preserve">67 on disk (</w:t>
+      </w:r>
+      <w:r>
+        <w:rPr>
+          <w:rStyle w:val="VerbatimChar"/>
+        </w:rPr>
+        <w:t xml:space="preserve">ls -d submodules/*/</w:t>
+      </w:r>
+      <w:r>
+        <w:t xml:space="preserve">) → 65 carry ≥1</w:t>
+      </w:r>
+      <w:r>
+        <w:t xml:space="preserve"> </w:t>
+      </w:r>
+      <w:r>
+        <w:rPr>
+          <w:rStyle w:val="VerbatimChar"/>
+        </w:rPr>
+        <w:t xml:space="preserve">| submodule |</w:t>
+      </w:r>
+      <w:r>
+        <w:t xml:space="preserve"> </w:t>
+      </w:r>
+      <w:r>
+        <w:t xml:space="preserve">capability row + 2 documented exclusions (</w:t>
+      </w:r>
+      <w:r>
+        <w:rPr>
+          <w:rStyle w:val="VerbatimChar"/>
+        </w:rPr>
+        <w:t xml:space="preserve">docs_chain</w:t>
+      </w:r>
+      <w:r>
+        <w:t xml:space="preserve">,</w:t>
+      </w:r>
+      <w:r>
+        <w:t xml:space="preserve"> </w:t>
+      </w:r>
+      <w:r>
+        <w:rPr>
+          <w:rStyle w:val="VerbatimChar"/>
+        </w:rPr>
+        <w:t xml:space="preserve">challenges</w:t>
+      </w:r>
+      <w:r>
+        <w:t xml:space="preserve">) = 0 silently</w:t>
+      </w:r>
+      <w:r>
+        <w:t xml:space="preserve"> </w:t>
+      </w:r>
+      <w:r>
+        <w:t xml:space="preserve">missing (rev8:</w:t>
+      </w:r>
+      <w:r>
+        <w:t xml:space="preserve"> </w:t>
+      </w:r>
+      <w:r>
+        <w:rPr>
+          <w:rStyle w:val="VerbatimChar"/>
+        </w:rPr>
+        <w:t xml:space="preserve">claude-toolkit</w:t>
+      </w:r>
+      <w:r>
+        <w:t xml:space="preserve"> </w:t>
+      </w:r>
+      <w:r>
+        <w:t xml:space="preserve">row added; 135 feature rows across 65 distinct</w:t>
+      </w:r>
+      <w:r>
+        <w:t xml:space="preserve"> </w:t>
+      </w:r>
+      <w:r>
+        <w:t xml:space="preserve">names. The prior</w:t>
+      </w:r>
+      <w:r>
+        <w:t xml:space="preserve"> </w:t>
+      </w:r>
+      <w:r>
+        <w:t xml:space="preserve">“50 inventoried / 55 rows”</w:t>
+      </w:r>
+      <w:r>
+        <w:t xml:space="preserve"> </w:t>
+      </w:r>
+      <w:r>
+        <w:t xml:space="preserve">undercounted.)</w:t>
       </w:r>
     </w:p>
     <w:p>
@@ -1568,7 +1759,43 @@
         <w:t xml:space="preserve"> </w:t>
       </w:r>
       <w:r>
-        <w:t xml:space="preserve">33 rows (20 landed, 3 partial, 10 planned — honest).</w:t>
+        <w:t xml:space="preserve">33 rows (20 landed, 3 partial, 10 planned — honest), over</w:t>
+      </w:r>
+      <w:r>
+        <w:t xml:space="preserve"> </w:t>
+      </w:r>
+      <w:r>
+        <w:t xml:space="preserve">the 50-agent</w:t>
+      </w:r>
+      <w:r>
+        <w:t xml:space="preserve"> </w:t>
+      </w:r>
+      <w:r>
+        <w:rPr>
+          <w:rStyle w:val="VerbatimChar"/>
+        </w:rPr>
+        <w:t xml:space="preserve">cli_agents/</w:t>
+      </w:r>
+      <w:r>
+        <w:t xml:space="preserve"> </w:t>
+      </w:r>
+      <w:r>
+        <w:t xml:space="preserve">catalogue (= 50</w:t>
+      </w:r>
+      <w:r>
+        <w:t xml:space="preserve"> </w:t>
+      </w:r>
+      <w:r>
+        <w:rPr>
+          <w:rStyle w:val="VerbatimChar"/>
+        </w:rPr>
+        <w:t xml:space="preserve">.gitmodules</w:t>
+      </w:r>
+      <w:r>
+        <w:t xml:space="preserve"> </w:t>
+      </w:r>
+      <w:r>
+        <w:t xml:space="preserve">entries; rev8: 51→50).</w:t>
       </w:r>
     </w:p>
     <w:p>

</xml_diff>